<commit_message>
Add response letter as Word file
Co-Authored-By: Claude Sonnet 5.5 <noreply@anthropic.com>
Claude-Session: https://claude.ai/code/session_01XNqQkA7mvU87z8UPaNFKPZ
</commit_message>
<xml_diff>
--- a/pay_stagnation/Response_to_editor.docx
+++ b/pay_stagnation/Response_to_editor.docx
@@ -44,34 +44,7 @@
         <w:pStyle w:val="BodyText"/>
       </w:pPr>
       <w:r>
-        <w:t xml:space="preserve">Thank you for the technical check. I have addressed each request below; changes are marked as tracked changes in</w:t>
-      </w:r>
-      <w:r>
-        <w:t xml:space="preserve"> </w:t>
-      </w:r>
-      <w:r>
-        <w:rPr>
-          <w:rStyle w:val="VerbatimChar"/>
-        </w:rPr>
-        <w:t xml:space="preserve">HSSC_manuscript_revised_tracked.docx</w:t>
-      </w:r>
-      <w:r>
-        <w:t xml:space="preserve"> </w:t>
-      </w:r>
-      <w:r>
-        <w:t xml:space="preserve">(a clean copy is</w:t>
-      </w:r>
-      <w:r>
-        <w:t xml:space="preserve"> </w:t>
-      </w:r>
-      <w:r>
-        <w:rPr>
-          <w:rStyle w:val="VerbatimChar"/>
-        </w:rPr>
-        <w:t xml:space="preserve">HSSC_manuscript_revised.docx</w:t>
-      </w:r>
-      <w:r>
-        <w:t xml:space="preserve">).</w:t>
+        <w:t xml:space="preserve">Thank you for the technical check. I have addressed each request below; the revised manuscript is attached with all changes shown as tracked changes.</w:t>
       </w:r>
     </w:p>
     <w:p>
@@ -85,11 +58,17 @@
         </w:rPr>
         <w:t xml:space="preserve">1. Data and supporting documentation</w:t>
       </w:r>
-      <w:r>
-        <w:t xml:space="preserve"> </w:t>
-      </w:r>
-      <w:r>
-        <w:t xml:space="preserve">- The dataset behind Tables 1-2, Figs 1-2 and the figures quoted in the text, variable definitions, the handling of missing years (no interpolation), every transformation (CPI deflation, 2013 = 100 indices, compound growth rates, ratios), and a script that recomputes every derived number are deposited at https://github.com/ooklee-sudo/fluffy-meme/tree/main/pay_stagnation (</w:t>
+    </w:p>
+    <w:p>
+      <w:pPr>
+        <w:numPr>
+          <w:ilvl w:val="0"/>
+          <w:numId w:val="1001"/>
+        </w:numPr>
+        <w:pStyle w:val="Compact"/>
+      </w:pPr>
+      <w:r>
+        <w:t xml:space="preserve">The dataset behind Tables 1-2, Figs 1-2 and the figures quoted in the text, variable definitions, the handling of missing years (no interpolation), every transformation (CPI deflation, 2013 = 100 indices, compound growth rates, ratios), and a script that recomputes every derived number are deposited at https://github.com/ooklee-sudo/fluffy-meme/tree/main/pay_stagnation (</w:t>
       </w:r>
       <w:r>
         <w:rPr>
@@ -124,34 +103,40 @@
       <w:r>
         <w:t xml:space="preserve">). The study uses no individual-level or restricted data; the underlying figures are the published sources listed in Supplementary Table S1.</w:t>
       </w:r>
-      <w:r>
-        <w:t xml:space="preserve"> </w:t>
-      </w:r>
-      <w:r>
-        <w:t xml:space="preserve">- A Data Availability statement is at the end of the manuscript and is entered identically under</w:t>
-      </w:r>
-      <w:r>
-        <w:t xml:space="preserve"> </w:t>
-      </w:r>
-      <w:r>
-        <w:t xml:space="preserve">“</w:t>
-      </w:r>
-      <w:r>
-        <w:t xml:space="preserve">Declarations</w:t>
-      </w:r>
-      <w:r>
-        <w:t xml:space="preserve">”</w:t>
-      </w:r>
-      <w:r>
-        <w:t xml:space="preserve"> </w:t>
-      </w:r>
-      <w:r>
-        <w:t xml:space="preserve">in the submission system.</w:t>
-      </w:r>
     </w:p>
     <w:p>
       <w:pPr>
-        <w:pStyle w:val="BodyText"/>
+        <w:numPr>
+          <w:ilvl w:val="0"/>
+          <w:numId w:val="1001"/>
+        </w:numPr>
+        <w:pStyle w:val="Compact"/>
+      </w:pPr>
+      <w:r>
+        <w:t xml:space="preserve">A Data Availability statement is at the end of the manuscript and is entered identically under</w:t>
+      </w:r>
+      <w:r>
+        <w:t xml:space="preserve"> </w:t>
+      </w:r>
+      <w:r>
+        <w:t xml:space="preserve">“</w:t>
+      </w:r>
+      <w:r>
+        <w:t xml:space="preserve">Declarations</w:t>
+      </w:r>
+      <w:r>
+        <w:t xml:space="preserve">”</w:t>
+      </w:r>
+      <w:r>
+        <w:t xml:space="preserve"> </w:t>
+      </w:r>
+      <w:r>
+        <w:t xml:space="preserve">in the submission system.</w:t>
+      </w:r>
+    </w:p>
+    <w:p>
+      <w:pPr>
+        <w:pStyle w:val="FirstParagraph"/>
       </w:pPr>
       <w:r>
         <w:rPr>
@@ -160,11 +145,17 @@
         </w:rPr>
         <w:t xml:space="preserve">2. Accurate reporting, overstated conclusions, limitations</w:t>
       </w:r>
-      <w:r>
-        <w:t xml:space="preserve"> </w:t>
-      </w:r>
-      <w:r>
-        <w:t xml:space="preserve">- Title, Discussion and Conclusions:</w:t>
+    </w:p>
+    <w:p>
+      <w:pPr>
+        <w:numPr>
+          <w:ilvl w:val="0"/>
+          <w:numId w:val="1002"/>
+        </w:numPr>
+        <w:pStyle w:val="Compact"/>
+      </w:pPr>
+      <w:r>
+        <w:t xml:space="preserve">Title, Discussion and Conclusions:</w:t>
       </w:r>
       <w:r>
         <w:t xml:space="preserve"> </w:t>
@@ -298,17 +289,29 @@
       <w:r>
         <w:t xml:space="preserve">; the policy paragraph is framed as conditional on the argument.</w:t>
       </w:r>
-      <w:r>
-        <w:t xml:space="preserve"> </w:t>
-      </w:r>
-      <w:r>
-        <w:t xml:space="preserve">- New limitations paragraph at the end of the Discussion: descriptive design and no controls; sparse salary series (7 of 12 years) and the possibly understated 2013 value; secondary press sources; differing large-firm samples (211-366 firms); averages across fields; the career-stage assumption in the executive comparison.</w:t>
-      </w:r>
-      <w:r>
-        <w:t xml:space="preserve"> </w:t>
-      </w:r>
-      <w:r>
-        <w:t xml:space="preserve">- Results: stated that the -12% real fall rests on the 2019 and 2024 observations only; labelled the 4.3% (employees) and 1.6% (professors) growth rates as nominal and noted their slightly different windows; the abstract now says</w:t>
+    </w:p>
+    <w:p>
+      <w:pPr>
+        <w:numPr>
+          <w:ilvl w:val="0"/>
+          <w:numId w:val="1002"/>
+        </w:numPr>
+        <w:pStyle w:val="Compact"/>
+      </w:pPr>
+      <w:r>
+        <w:t xml:space="preserve">New limitations paragraph at the end of the Discussion: descriptive design and no controls; sparse salary series (7 of 12 years) and the possibly understated 2013 value; secondary press sources; differing large-firm samples (211-366 firms); averages across fields; the career-stage assumption in the executive comparison.</w:t>
+      </w:r>
+    </w:p>
+    <w:p>
+      <w:pPr>
+        <w:numPr>
+          <w:ilvl w:val="0"/>
+          <w:numId w:val="1002"/>
+        </w:numPr>
+        <w:pStyle w:val="Compact"/>
+      </w:pPr>
+      <w:r>
+        <w:t xml:space="preserve">Results: stated that the -12% real fall rests on the 2019 and 2024 observations only; labelled the 4.3% (employees) and 1.6% (professors) growth rates as nominal and noted their slightly different windows; the abstract now says</w:t>
       </w:r>
       <w:r>
         <w:t xml:space="preserve"> </w:t>
@@ -325,17 +328,29 @@
       <w:r>
         <w:t xml:space="preserve">.</w:t>
       </w:r>
-      <w:r>
-        <w:t xml:space="preserve"> </w:t>
-      </w:r>
-      <w:r>
-        <w:t xml:space="preserve">- Methods/Results: the time-to-full-professor estimate is now explicitly presented as the author’s observation, since no systematic source was found.</w:t>
-      </w:r>
-      <w:r>
-        <w:t xml:space="preserve"> </w:t>
-      </w:r>
-      <w:r>
-        <w:t xml:space="preserve">- All derived figures were recomputed with</w:t>
+    </w:p>
+    <w:p>
+      <w:pPr>
+        <w:numPr>
+          <w:ilvl w:val="0"/>
+          <w:numId w:val="1002"/>
+        </w:numPr>
+        <w:pStyle w:val="Compact"/>
+      </w:pPr>
+      <w:r>
+        <w:t xml:space="preserve">Methods/Results: the time-to-full-professor estimate is now explicitly presented as the author’s observation, since no systematic source was found.</w:t>
+      </w:r>
+    </w:p>
+    <w:p>
+      <w:pPr>
+        <w:numPr>
+          <w:ilvl w:val="0"/>
+          <w:numId w:val="1002"/>
+        </w:numPr>
+        <w:pStyle w:val="Compact"/>
+      </w:pPr>
+      <w:r>
+        <w:t xml:space="preserve">All derived figures were recomputed with</w:t>
       </w:r>
       <w:r>
         <w:t xml:space="preserve"> </w:t>
@@ -355,14 +370,16 @@
     </w:p>
     <w:p>
       <w:pPr>
+        <w:pStyle w:val="FirstParagraph"/>
+      </w:pPr>
+      <w:r>
+        <w:t xml:space="preserve">Kind regards,</w:t>
+      </w:r>
+    </w:p>
+    <w:p>
+      <w:pPr>
         <w:pStyle w:val="BodyText"/>
       </w:pPr>
-      <w:r>
-        <w:t xml:space="preserve">Kind regards,</w:t>
-      </w:r>
-      <w:r>
-        <w:t xml:space="preserve"> </w:t>
-      </w:r>
       <w:r>
         <w:t xml:space="preserve">Ook Lee</w:t>
       </w:r>
@@ -474,8 +491,90 @@
       </w:pPr>
     </w:lvl>
   </w:abstractNum>
+  <w:abstractNum w:abstractNumId="991">
+    <w:nsid w:val="A991"/>
+    <w:multiLevelType w:val="multilevel"/>
+    <w:lvl w:ilvl="0">
+      <w:numFmt w:val="bullet"/>
+      <w:lvlText w:val="•"/>
+      <w:lvlJc w:val="left"/>
+      <w:pPr>
+        <w:ind w:left="720" w:hanging="480"/>
+      </w:pPr>
+    </w:lvl>
+    <w:lvl w:ilvl="1">
+      <w:numFmt w:val="bullet"/>
+      <w:lvlText w:val="–"/>
+      <w:lvlJc w:val="left"/>
+      <w:pPr>
+        <w:ind w:left="1440" w:hanging="480"/>
+      </w:pPr>
+    </w:lvl>
+    <w:lvl w:ilvl="2">
+      <w:numFmt w:val="bullet"/>
+      <w:lvlText w:val="•"/>
+      <w:lvlJc w:val="left"/>
+      <w:pPr>
+        <w:ind w:left="2160" w:hanging="480"/>
+      </w:pPr>
+    </w:lvl>
+    <w:lvl w:ilvl="3">
+      <w:numFmt w:val="bullet"/>
+      <w:lvlText w:val="–"/>
+      <w:lvlJc w:val="left"/>
+      <w:pPr>
+        <w:ind w:left="2880" w:hanging="480"/>
+      </w:pPr>
+    </w:lvl>
+    <w:lvl w:ilvl="4">
+      <w:numFmt w:val="bullet"/>
+      <w:lvlText w:val="•"/>
+      <w:lvlJc w:val="left"/>
+      <w:pPr>
+        <w:ind w:left="3600" w:hanging="480"/>
+      </w:pPr>
+    </w:lvl>
+    <w:lvl w:ilvl="5">
+      <w:numFmt w:val="bullet"/>
+      <w:lvlText w:val="–"/>
+      <w:lvlJc w:val="left"/>
+      <w:pPr>
+        <w:ind w:left="4320" w:hanging="480"/>
+      </w:pPr>
+    </w:lvl>
+    <w:lvl w:ilvl="6">
+      <w:numFmt w:val="bullet"/>
+      <w:lvlText w:val="•"/>
+      <w:lvlJc w:val="left"/>
+      <w:pPr>
+        <w:ind w:left="5040" w:hanging="480"/>
+      </w:pPr>
+    </w:lvl>
+    <w:lvl w:ilvl="7">
+      <w:numFmt w:val="bullet"/>
+      <w:lvlText w:val="–"/>
+      <w:lvlJc w:val="left"/>
+      <w:pPr>
+        <w:ind w:left="5760" w:hanging="480"/>
+      </w:pPr>
+    </w:lvl>
+    <w:lvl w:ilvl="8">
+      <w:numFmt w:val="bullet"/>
+      <w:lvlText w:val="•"/>
+      <w:lvlJc w:val="left"/>
+      <w:pPr>
+        <w:ind w:left="6480" w:hanging="480"/>
+      </w:pPr>
+    </w:lvl>
+  </w:abstractNum>
   <w:num w:numId="1000">
     <w:abstractNumId w:val="990"/>
+  </w:num>
+  <w:num w:numId="1001">
+    <w:abstractNumId w:val="991"/>
+  </w:num>
+  <w:num w:numId="1002">
+    <w:abstractNumId w:val="991"/>
   </w:num>
 </w:numbering>
 </file>

</xml_diff>